<commit_message>
Add linked HTML questionnaire walkthrough
</commit_message>
<xml_diff>
--- a/GHID-SCURT-INTEGRARE-CHestionare.docx
+++ b/GHID-SCURT-INTEGRARE-CHestionare.docx
@@ -119,7 +119,7 @@
           <w:color w:val="202124"/>
           <w:sz w:val="22"/>
         </w:rPr>
-        <w:t>Sunt incluse cele 9 chestionare, pagina de alegere a chestionarului, calculele de scor și răspunsul personalizat, formularul de contact, validarea datelor, endpoint-ul pentru lead-uri și toate landing page-urile legate de rezultate. Designul și textele au fost păstrate.</w:t>
+        <w:t>Sunt incluse cele 9 chestionare, pagina de alegere a chestionarului, calculele de scor și răspunsul personalizat, formularul de contact, validarea datelor, endpoint-ul pentru lead-uri și toate landing page-urile legate de rezultate. Pentru vizualizare rapidă, folderul PREVIZUALIZARE_HTML conține pagini HTML legate între ele. Designul și textele live au fost păstrate în aplicația principală.</w:t>
       </w:r>
     </w:p>
     <w:p>
@@ -653,7 +653,7 @@
           <w:color w:val="202124"/>
           <w:sz w:val="22"/>
         </w:rPr>
-        <w:t>Acesta este un proiect Next.js separat, nu un plugin WordPress care se lipește în Theme File Editor. Varianta recomandată este publicarea lui pe un subdomeniu (de exemplu chestionare.emmanuel-clinix.ro), iar WordPress trimite către /evaluare sau /chestionare. Alternativ, hostingul poate configura reverse proxy pentru rutele din pachet.</w:t>
+        <w:t>Pentru a înțelege repede traseele, deschide PREVIZUALIZARE_HTML/index.html în orice browser. Fiecare fișier HTML are butoane către următorul pas: selector → test → rezultat → landing page. Este un ghid de navigare, nu înlocuiește aplicația live.</w:t>
       </w:r>
     </w:p>
     <w:p>
@@ -667,7 +667,7 @@
           <w:color w:val="202124"/>
           <w:sz w:val="22"/>
         </w:rPr>
-        <w:t>Înainte de lansare: configurează GHL_WEBHOOK_URL pentru lead-uri și completează paginile Politica de confidențialitate și Termeni și condiții cu textele juridice aprobate. Pentru detalii tehnice, vezi INTEGRATION.md și ROUTES.md din arhivă.</w:t>
+        <w:t>Acesta este un proiect Next.js separat, nu un plugin WordPress care se lipește în Theme File Editor. Varianta recomandată este publicarea lui pe un subdomeniu (de exemplu chestionare.emmanuel-clinix.ro), iar WordPress trimite către /evaluare sau /chestionare. Înainte de lansare: configurează GHL_WEBHOOK_URL și completează paginile Politica de confidențialitate și Termeni și condiții. Pentru detalii tehnice, vezi INTEGRATION.md și ROUTES.md.</w:t>
       </w:r>
     </w:p>
     <w:sectPr>

</xml_diff>

<commit_message>
Revert "Add linked HTML questionnaire walkthrough"
This reverts commit 9db5aecea01b0823bd2f7975f40361d30ffdc190.
</commit_message>
<xml_diff>
--- a/GHID-SCURT-INTEGRARE-CHestionare.docx
+++ b/GHID-SCURT-INTEGRARE-CHestionare.docx
@@ -119,7 +119,7 @@
           <w:color w:val="202124"/>
           <w:sz w:val="22"/>
         </w:rPr>
-        <w:t>Sunt incluse cele 9 chestionare, pagina de alegere a chestionarului, calculele de scor și răspunsul personalizat, formularul de contact, validarea datelor, endpoint-ul pentru lead-uri și toate landing page-urile legate de rezultate. Pentru vizualizare rapidă, folderul PREVIZUALIZARE_HTML conține pagini HTML legate între ele. Designul și textele live au fost păstrate în aplicația principală.</w:t>
+        <w:t>Sunt incluse cele 9 chestionare, pagina de alegere a chestionarului, calculele de scor și răspunsul personalizat, formularul de contact, validarea datelor, endpoint-ul pentru lead-uri și toate landing page-urile legate de rezultate. Designul și textele au fost păstrate.</w:t>
       </w:r>
     </w:p>
     <w:p>
@@ -653,7 +653,7 @@
           <w:color w:val="202124"/>
           <w:sz w:val="22"/>
         </w:rPr>
-        <w:t>Pentru a înțelege repede traseele, deschide PREVIZUALIZARE_HTML/index.html în orice browser. Fiecare fișier HTML are butoane către următorul pas: selector → test → rezultat → landing page. Este un ghid de navigare, nu înlocuiește aplicația live.</w:t>
+        <w:t>Acesta este un proiect Next.js separat, nu un plugin WordPress care se lipește în Theme File Editor. Varianta recomandată este publicarea lui pe un subdomeniu (de exemplu chestionare.emmanuel-clinix.ro), iar WordPress trimite către /evaluare sau /chestionare. Alternativ, hostingul poate configura reverse proxy pentru rutele din pachet.</w:t>
       </w:r>
     </w:p>
     <w:p>
@@ -667,7 +667,7 @@
           <w:color w:val="202124"/>
           <w:sz w:val="22"/>
         </w:rPr>
-        <w:t>Acesta este un proiect Next.js separat, nu un plugin WordPress care se lipește în Theme File Editor. Varianta recomandată este publicarea lui pe un subdomeniu (de exemplu chestionare.emmanuel-clinix.ro), iar WordPress trimite către /evaluare sau /chestionare. Înainte de lansare: configurează GHL_WEBHOOK_URL și completează paginile Politica de confidențialitate și Termeni și condiții. Pentru detalii tehnice, vezi INTEGRATION.md și ROUTES.md.</w:t>
+        <w:t>Înainte de lansare: configurează GHL_WEBHOOK_URL pentru lead-uri și completează paginile Politica de confidențialitate și Termeni și condiții cu textele juridice aprobate. Pentru detalii tehnice, vezi INTEGRATION.md și ROUTES.md din arhivă.</w:t>
       </w:r>
     </w:p>
     <w:sectPr>

</xml_diff>